<commit_message>
chore(fixtures): PO sample generators, demo assets, and npm scripts
- Expand PO sample fixtures (docx/pdf/image) and add demo seed/inject/render
  generators for the PO inbox demo flow
- Add po-inject, po-demo-seed, and test:integration npm scripts
- Add @napi-rs/canvas for fixture image rendering
</commit_message>
<xml_diff>
--- a/tests/fixtures/po-samples/docx/07-spice-room-bulk-order.docx
+++ b/tests/fixtures/po-samples/docx/07-spice-room-bulk-order.docx
@@ -304,26 +304,26 @@
                 <w:sz w:val="18"/>
                 <w:szCs w:val="18"/>
               </w:rPr>
-              <w:t xml:space="preserve">Pad Thai Sauce 200g</w:t>
-            </w:r>
-          </w:p>
-        </w:tc>
-        <w:tc>
-          <w:tcPr>
-            <w:tcMar>
-              <w:top w:type="dxa" w:w="80"/>
-              <w:left w:type="dxa" w:w="120"/>
-              <w:bottom w:type="dxa" w:w="80"/>
-              <w:right w:type="dxa" w:w="120"/>
-            </w:tcMar>
-          </w:tcPr>
-          <w:p>
-            <w:r>
-              <w:rPr>
-                <w:sz w:val="18"/>
-                <w:szCs w:val="18"/>
-              </w:rPr>
-              <w:t xml:space="preserve">24</w:t>
+              <w:t xml:space="preserve">Satay Sauce 250ml</w:t>
+            </w:r>
+          </w:p>
+        </w:tc>
+        <w:tc>
+          <w:tcPr>
+            <w:tcMar>
+              <w:top w:type="dxa" w:w="80"/>
+              <w:left w:type="dxa" w:w="120"/>
+              <w:bottom w:type="dxa" w:w="80"/>
+              <w:right w:type="dxa" w:w="120"/>
+            </w:tcMar>
+          </w:tcPr>
+          <w:p>
+            <w:r>
+              <w:rPr>
+                <w:sz w:val="18"/>
+                <w:szCs w:val="18"/>
+              </w:rPr>
+              <w:t xml:space="preserve">12</w:t>
             </w:r>
           </w:p>
         </w:tc>
@@ -361,7 +361,7 @@
                 <w:sz w:val="18"/>
                 <w:szCs w:val="18"/>
               </w:rPr>
-              <w:t xml:space="preserve">4 cartons (6)</w:t>
+              <w:t xml:space="preserve">2 cartons (6)</w:t>
             </w:r>
           </w:p>
         </w:tc>
@@ -401,26 +401,26 @@
                 <w:sz w:val="18"/>
                 <w:szCs w:val="18"/>
               </w:rPr>
-              <w:t xml:space="preserve">Satay Sauce 250ml</w:t>
-            </w:r>
-          </w:p>
-        </w:tc>
-        <w:tc>
-          <w:tcPr>
-            <w:tcMar>
-              <w:top w:type="dxa" w:w="80"/>
-              <w:left w:type="dxa" w:w="120"/>
-              <w:bottom w:type="dxa" w:w="80"/>
-              <w:right w:type="dxa" w:w="120"/>
-            </w:tcMar>
-          </w:tcPr>
-          <w:p>
-            <w:r>
-              <w:rPr>
-                <w:sz w:val="18"/>
-                <w:szCs w:val="18"/>
-              </w:rPr>
-              <w:t xml:space="preserve">12</w:t>
+              <w:t xml:space="preserve">Sweet Chilli Sauce 435ml</w:t>
+            </w:r>
+          </w:p>
+        </w:tc>
+        <w:tc>
+          <w:tcPr>
+            <w:tcMar>
+              <w:top w:type="dxa" w:w="80"/>
+              <w:left w:type="dxa" w:w="120"/>
+              <w:bottom w:type="dxa" w:w="80"/>
+              <w:right w:type="dxa" w:w="120"/>
+            </w:tcMar>
+          </w:tcPr>
+          <w:p>
+            <w:r>
+              <w:rPr>
+                <w:sz w:val="18"/>
+                <w:szCs w:val="18"/>
+              </w:rPr>
+              <w:t xml:space="preserve">18</w:t>
             </w:r>
           </w:p>
         </w:tc>
@@ -458,7 +458,7 @@
                 <w:sz w:val="18"/>
                 <w:szCs w:val="18"/>
               </w:rPr>
-              <w:t xml:space="preserve">2 cartons (6)</w:t>
+              <w:t xml:space="preserve">3 cartons (6)</w:t>
             </w:r>
           </w:p>
         </w:tc>
@@ -498,64 +498,64 @@
                 <w:sz w:val="18"/>
                 <w:szCs w:val="18"/>
               </w:rPr>
-              <w:t xml:space="preserve">Crispy Chilli Oil 200g</w:t>
-            </w:r>
-          </w:p>
-        </w:tc>
-        <w:tc>
-          <w:tcPr>
-            <w:tcMar>
-              <w:top w:type="dxa" w:w="80"/>
-              <w:left w:type="dxa" w:w="120"/>
-              <w:bottom w:type="dxa" w:w="80"/>
-              <w:right w:type="dxa" w:w="120"/>
-            </w:tcMar>
-          </w:tcPr>
-          <w:p>
-            <w:r>
-              <w:rPr>
-                <w:sz w:val="18"/>
-                <w:szCs w:val="18"/>
-              </w:rPr>
-              <w:t xml:space="preserve">6</w:t>
-            </w:r>
-          </w:p>
-        </w:tc>
-        <w:tc>
-          <w:tcPr>
-            <w:tcMar>
-              <w:top w:type="dxa" w:w="80"/>
-              <w:left w:type="dxa" w:w="120"/>
-              <w:bottom w:type="dxa" w:w="80"/>
-              <w:right w:type="dxa" w:w="120"/>
-            </w:tcMar>
-          </w:tcPr>
-          <w:p>
-            <w:r>
-              <w:rPr>
-                <w:sz w:val="18"/>
-                <w:szCs w:val="18"/>
-              </w:rPr>
-              <w:t xml:space="preserve">jars</w:t>
-            </w:r>
-          </w:p>
-        </w:tc>
-        <w:tc>
-          <w:tcPr>
-            <w:tcMar>
-              <w:top w:type="dxa" w:w="80"/>
-              <w:left w:type="dxa" w:w="120"/>
-              <w:bottom w:type="dxa" w:w="80"/>
-              <w:right w:type="dxa" w:w="120"/>
-            </w:tcMar>
-          </w:tcPr>
-          <w:p>
-            <w:r>
-              <w:rPr>
-                <w:sz w:val="18"/>
-                <w:szCs w:val="18"/>
-              </w:rPr>
-              <w:t xml:space="preserve">1 carton (6)</w:t>
+              <w:t xml:space="preserve">Oyster Sauce 210ml</w:t>
+            </w:r>
+          </w:p>
+        </w:tc>
+        <w:tc>
+          <w:tcPr>
+            <w:tcMar>
+              <w:top w:type="dxa" w:w="80"/>
+              <w:left w:type="dxa" w:w="120"/>
+              <w:bottom w:type="dxa" w:w="80"/>
+              <w:right w:type="dxa" w:w="120"/>
+            </w:tcMar>
+          </w:tcPr>
+          <w:p>
+            <w:r>
+              <w:rPr>
+                <w:sz w:val="18"/>
+                <w:szCs w:val="18"/>
+              </w:rPr>
+              <w:t xml:space="preserve">12</w:t>
+            </w:r>
+          </w:p>
+        </w:tc>
+        <w:tc>
+          <w:tcPr>
+            <w:tcMar>
+              <w:top w:type="dxa" w:w="80"/>
+              <w:left w:type="dxa" w:w="120"/>
+              <w:bottom w:type="dxa" w:w="80"/>
+              <w:right w:type="dxa" w:w="120"/>
+            </w:tcMar>
+          </w:tcPr>
+          <w:p>
+            <w:r>
+              <w:rPr>
+                <w:sz w:val="18"/>
+                <w:szCs w:val="18"/>
+              </w:rPr>
+              <w:t xml:space="preserve">bottles</w:t>
+            </w:r>
+          </w:p>
+        </w:tc>
+        <w:tc>
+          <w:tcPr>
+            <w:tcMar>
+              <w:top w:type="dxa" w:w="80"/>
+              <w:left w:type="dxa" w:w="120"/>
+              <w:bottom w:type="dxa" w:w="80"/>
+              <w:right w:type="dxa" w:w="120"/>
+            </w:tcMar>
+          </w:tcPr>
+          <w:p>
+            <w:r>
+              <w:rPr>
+                <w:sz w:val="18"/>
+                <w:szCs w:val="18"/>
+              </w:rPr>
+              <w:t xml:space="preserve">2 cartons (6)</w:t>
             </w:r>
           </w:p>
         </w:tc>
@@ -595,26 +595,26 @@
                 <w:sz w:val="18"/>
                 <w:szCs w:val="18"/>
               </w:rPr>
-              <w:t xml:space="preserve">Sweet Chilli Sauce 435ml</w:t>
-            </w:r>
-          </w:p>
-        </w:tc>
-        <w:tc>
-          <w:tcPr>
-            <w:tcMar>
-              <w:top w:type="dxa" w:w="80"/>
-              <w:left w:type="dxa" w:w="120"/>
-              <w:bottom w:type="dxa" w:w="80"/>
-              <w:right w:type="dxa" w:w="120"/>
-            </w:tcMar>
-          </w:tcPr>
-          <w:p>
-            <w:r>
-              <w:rPr>
-                <w:sz w:val="18"/>
-                <w:szCs w:val="18"/>
-              </w:rPr>
-              <w:t xml:space="preserve">18</w:t>
+              <w:t xml:space="preserve">Fish Sauce 420ml</w:t>
+            </w:r>
+          </w:p>
+        </w:tc>
+        <w:tc>
+          <w:tcPr>
+            <w:tcMar>
+              <w:top w:type="dxa" w:w="80"/>
+              <w:left w:type="dxa" w:w="120"/>
+              <w:bottom w:type="dxa" w:w="80"/>
+              <w:right w:type="dxa" w:w="120"/>
+            </w:tcMar>
+          </w:tcPr>
+          <w:p>
+            <w:r>
+              <w:rPr>
+                <w:sz w:val="18"/>
+                <w:szCs w:val="18"/>
+              </w:rPr>
+              <w:t xml:space="preserve">6</w:t>
             </w:r>
           </w:p>
         </w:tc>
@@ -652,7 +652,7 @@
                 <w:sz w:val="18"/>
                 <w:szCs w:val="18"/>
               </w:rPr>
-              <w:t xml:space="preserve">3 cartons (6)</w:t>
+              <w:t xml:space="preserve">1 carton (6)</w:t>
             </w:r>
           </w:p>
         </w:tc>
@@ -692,64 +692,64 @@
                 <w:sz w:val="18"/>
                 <w:szCs w:val="18"/>
               </w:rPr>
-              <w:t xml:space="preserve">Oyster Sauce 210ml</w:t>
-            </w:r>
-          </w:p>
-        </w:tc>
-        <w:tc>
-          <w:tcPr>
-            <w:tcMar>
-              <w:top w:type="dxa" w:w="80"/>
-              <w:left w:type="dxa" w:w="120"/>
-              <w:bottom w:type="dxa" w:w="80"/>
-              <w:right w:type="dxa" w:w="120"/>
-            </w:tcMar>
-          </w:tcPr>
-          <w:p>
-            <w:r>
-              <w:rPr>
-                <w:sz w:val="18"/>
-                <w:szCs w:val="18"/>
-              </w:rPr>
-              <w:t xml:space="preserve">12</w:t>
-            </w:r>
-          </w:p>
-        </w:tc>
-        <w:tc>
-          <w:tcPr>
-            <w:tcMar>
-              <w:top w:type="dxa" w:w="80"/>
-              <w:left w:type="dxa" w:w="120"/>
-              <w:bottom w:type="dxa" w:w="80"/>
-              <w:right w:type="dxa" w:w="120"/>
-            </w:tcMar>
-          </w:tcPr>
-          <w:p>
-            <w:r>
-              <w:rPr>
-                <w:sz w:val="18"/>
-                <w:szCs w:val="18"/>
-              </w:rPr>
-              <w:t xml:space="preserve">bottles</w:t>
-            </w:r>
-          </w:p>
-        </w:tc>
-        <w:tc>
-          <w:tcPr>
-            <w:tcMar>
-              <w:top w:type="dxa" w:w="80"/>
-              <w:left w:type="dxa" w:w="120"/>
-              <w:bottom w:type="dxa" w:w="80"/>
-              <w:right w:type="dxa" w:w="120"/>
-            </w:tcMar>
-          </w:tcPr>
-          <w:p>
-            <w:r>
-              <w:rPr>
-                <w:sz w:val="18"/>
-                <w:szCs w:val="18"/>
-              </w:rPr>
-              <w:t xml:space="preserve">2 cartons (6)</w:t>
+              <w:t xml:space="preserve">Rice Noodles 200g</w:t>
+            </w:r>
+          </w:p>
+        </w:tc>
+        <w:tc>
+          <w:tcPr>
+            <w:tcMar>
+              <w:top w:type="dxa" w:w="80"/>
+              <w:left w:type="dxa" w:w="120"/>
+              <w:bottom w:type="dxa" w:w="80"/>
+              <w:right w:type="dxa" w:w="120"/>
+            </w:tcMar>
+          </w:tcPr>
+          <w:p>
+            <w:r>
+              <w:rPr>
+                <w:sz w:val="18"/>
+                <w:szCs w:val="18"/>
+              </w:rPr>
+              <w:t xml:space="preserve">24</w:t>
+            </w:r>
+          </w:p>
+        </w:tc>
+        <w:tc>
+          <w:tcPr>
+            <w:tcMar>
+              <w:top w:type="dxa" w:w="80"/>
+              <w:left w:type="dxa" w:w="120"/>
+              <w:bottom w:type="dxa" w:w="80"/>
+              <w:right w:type="dxa" w:w="120"/>
+            </w:tcMar>
+          </w:tcPr>
+          <w:p>
+            <w:r>
+              <w:rPr>
+                <w:sz w:val="18"/>
+                <w:szCs w:val="18"/>
+              </w:rPr>
+              <w:t xml:space="preserve">packets</w:t>
+            </w:r>
+          </w:p>
+        </w:tc>
+        <w:tc>
+          <w:tcPr>
+            <w:tcMar>
+              <w:top w:type="dxa" w:w="80"/>
+              <w:left w:type="dxa" w:w="120"/>
+              <w:bottom w:type="dxa" w:w="80"/>
+              <w:right w:type="dxa" w:w="120"/>
+            </w:tcMar>
+          </w:tcPr>
+          <w:p>
+            <w:r>
+              <w:rPr>
+                <w:sz w:val="18"/>
+                <w:szCs w:val="18"/>
+              </w:rPr>
+              <w:t xml:space="preserve">2 cartons (12)</w:t>
             </w:r>
           </w:p>
         </w:tc>
@@ -789,200 +789,6 @@
                 <w:sz w:val="18"/>
                 <w:szCs w:val="18"/>
               </w:rPr>
-              <w:t xml:space="preserve">Fish Sauce 420ml</w:t>
-            </w:r>
-          </w:p>
-        </w:tc>
-        <w:tc>
-          <w:tcPr>
-            <w:tcMar>
-              <w:top w:type="dxa" w:w="80"/>
-              <w:left w:type="dxa" w:w="120"/>
-              <w:bottom w:type="dxa" w:w="80"/>
-              <w:right w:type="dxa" w:w="120"/>
-            </w:tcMar>
-          </w:tcPr>
-          <w:p>
-            <w:r>
-              <w:rPr>
-                <w:sz w:val="18"/>
-                <w:szCs w:val="18"/>
-              </w:rPr>
-              <w:t xml:space="preserve">6</w:t>
-            </w:r>
-          </w:p>
-        </w:tc>
-        <w:tc>
-          <w:tcPr>
-            <w:tcMar>
-              <w:top w:type="dxa" w:w="80"/>
-              <w:left w:type="dxa" w:w="120"/>
-              <w:bottom w:type="dxa" w:w="80"/>
-              <w:right w:type="dxa" w:w="120"/>
-            </w:tcMar>
-          </w:tcPr>
-          <w:p>
-            <w:r>
-              <w:rPr>
-                <w:sz w:val="18"/>
-                <w:szCs w:val="18"/>
-              </w:rPr>
-              <w:t xml:space="preserve">bottles</w:t>
-            </w:r>
-          </w:p>
-        </w:tc>
-        <w:tc>
-          <w:tcPr>
-            <w:tcMar>
-              <w:top w:type="dxa" w:w="80"/>
-              <w:left w:type="dxa" w:w="120"/>
-              <w:bottom w:type="dxa" w:w="80"/>
-              <w:right w:type="dxa" w:w="120"/>
-            </w:tcMar>
-          </w:tcPr>
-          <w:p>
-            <w:r>
-              <w:rPr>
-                <w:sz w:val="18"/>
-                <w:szCs w:val="18"/>
-              </w:rPr>
-              <w:t xml:space="preserve">1 carton (6)</w:t>
-            </w:r>
-          </w:p>
-        </w:tc>
-      </w:tr>
-      <w:tr>
-        <w:tc>
-          <w:tcPr>
-            <w:tcMar>
-              <w:top w:type="dxa" w:w="80"/>
-              <w:left w:type="dxa" w:w="120"/>
-              <w:bottom w:type="dxa" w:w="80"/>
-              <w:right w:type="dxa" w:w="120"/>
-            </w:tcMar>
-          </w:tcPr>
-          <w:p>
-            <w:r>
-              <w:rPr>
-                <w:sz w:val="18"/>
-                <w:szCs w:val="18"/>
-              </w:rPr>
-              <w:t xml:space="preserve">—</w:t>
-            </w:r>
-          </w:p>
-        </w:tc>
-        <w:tc>
-          <w:tcPr>
-            <w:tcMar>
-              <w:top w:type="dxa" w:w="80"/>
-              <w:left w:type="dxa" w:w="120"/>
-              <w:bottom w:type="dxa" w:w="80"/>
-              <w:right w:type="dxa" w:w="120"/>
-            </w:tcMar>
-          </w:tcPr>
-          <w:p>
-            <w:r>
-              <w:rPr>
-                <w:sz w:val="18"/>
-                <w:szCs w:val="18"/>
-              </w:rPr>
-              <w:t xml:space="preserve">Rice Noodles 200g</w:t>
-            </w:r>
-          </w:p>
-        </w:tc>
-        <w:tc>
-          <w:tcPr>
-            <w:tcMar>
-              <w:top w:type="dxa" w:w="80"/>
-              <w:left w:type="dxa" w:w="120"/>
-              <w:bottom w:type="dxa" w:w="80"/>
-              <w:right w:type="dxa" w:w="120"/>
-            </w:tcMar>
-          </w:tcPr>
-          <w:p>
-            <w:r>
-              <w:rPr>
-                <w:sz w:val="18"/>
-                <w:szCs w:val="18"/>
-              </w:rPr>
-              <w:t xml:space="preserve">24</w:t>
-            </w:r>
-          </w:p>
-        </w:tc>
-        <w:tc>
-          <w:tcPr>
-            <w:tcMar>
-              <w:top w:type="dxa" w:w="80"/>
-              <w:left w:type="dxa" w:w="120"/>
-              <w:bottom w:type="dxa" w:w="80"/>
-              <w:right w:type="dxa" w:w="120"/>
-            </w:tcMar>
-          </w:tcPr>
-          <w:p>
-            <w:r>
-              <w:rPr>
-                <w:sz w:val="18"/>
-                <w:szCs w:val="18"/>
-              </w:rPr>
-              <w:t xml:space="preserve">packets</w:t>
-            </w:r>
-          </w:p>
-        </w:tc>
-        <w:tc>
-          <w:tcPr>
-            <w:tcMar>
-              <w:top w:type="dxa" w:w="80"/>
-              <w:left w:type="dxa" w:w="120"/>
-              <w:bottom w:type="dxa" w:w="80"/>
-              <w:right w:type="dxa" w:w="120"/>
-            </w:tcMar>
-          </w:tcPr>
-          <w:p>
-            <w:r>
-              <w:rPr>
-                <w:sz w:val="18"/>
-                <w:szCs w:val="18"/>
-              </w:rPr>
-              <w:t xml:space="preserve">2 cartons (12)</w:t>
-            </w:r>
-          </w:p>
-        </w:tc>
-      </w:tr>
-      <w:tr>
-        <w:tc>
-          <w:tcPr>
-            <w:tcMar>
-              <w:top w:type="dxa" w:w="80"/>
-              <w:left w:type="dxa" w:w="120"/>
-              <w:bottom w:type="dxa" w:w="80"/>
-              <w:right w:type="dxa" w:w="120"/>
-            </w:tcMar>
-          </w:tcPr>
-          <w:p>
-            <w:r>
-              <w:rPr>
-                <w:sz w:val="18"/>
-                <w:szCs w:val="18"/>
-              </w:rPr>
-              <w:t xml:space="preserve">—</w:t>
-            </w:r>
-          </w:p>
-        </w:tc>
-        <w:tc>
-          <w:tcPr>
-            <w:tcMar>
-              <w:top w:type="dxa" w:w="80"/>
-              <w:left w:type="dxa" w:w="120"/>
-              <w:bottom w:type="dxa" w:w="80"/>
-              <w:right w:type="dxa" w:w="120"/>
-            </w:tcMar>
-          </w:tcPr>
-          <w:p>
-            <w:r>
-              <w:rPr>
-                <w:sz w:val="18"/>
-                <w:szCs w:val="18"/>
-              </w:rPr>
               <w:t xml:space="preserve">Coconut Milk 400ml</w:t>
             </w:r>
           </w:p>
@@ -1003,297 +809,6 @@
                 <w:szCs w:val="18"/>
               </w:rPr>
               <w:t xml:space="preserve">12</w:t>
-            </w:r>
-          </w:p>
-        </w:tc>
-        <w:tc>
-          <w:tcPr>
-            <w:tcMar>
-              <w:top w:type="dxa" w:w="80"/>
-              <w:left w:type="dxa" w:w="120"/>
-              <w:bottom w:type="dxa" w:w="80"/>
-              <w:right w:type="dxa" w:w="120"/>
-            </w:tcMar>
-          </w:tcPr>
-          <w:p>
-            <w:r>
-              <w:rPr>
-                <w:sz w:val="18"/>
-                <w:szCs w:val="18"/>
-              </w:rPr>
-              <w:t xml:space="preserve">cans</w:t>
-            </w:r>
-          </w:p>
-        </w:tc>
-        <w:tc>
-          <w:tcPr>
-            <w:tcMar>
-              <w:top w:type="dxa" w:w="80"/>
-              <w:left w:type="dxa" w:w="120"/>
-              <w:bottom w:type="dxa" w:w="80"/>
-              <w:right w:type="dxa" w:w="120"/>
-            </w:tcMar>
-          </w:tcPr>
-          <w:p>
-            <w:r>
-              <w:rPr>
-                <w:sz w:val="18"/>
-                <w:szCs w:val="18"/>
-              </w:rPr>
-              <w:t xml:space="preserve">1 carton (12)</w:t>
-            </w:r>
-          </w:p>
-        </w:tc>
-      </w:tr>
-      <w:tr>
-        <w:tc>
-          <w:tcPr>
-            <w:tcMar>
-              <w:top w:type="dxa" w:w="80"/>
-              <w:left w:type="dxa" w:w="120"/>
-              <w:bottom w:type="dxa" w:w="80"/>
-              <w:right w:type="dxa" w:w="120"/>
-            </w:tcMar>
-          </w:tcPr>
-          <w:p>
-            <w:r>
-              <w:rPr>
-                <w:sz w:val="18"/>
-                <w:szCs w:val="18"/>
-              </w:rPr>
-              <w:t xml:space="preserve">—</w:t>
-            </w:r>
-          </w:p>
-        </w:tc>
-        <w:tc>
-          <w:tcPr>
-            <w:tcMar>
-              <w:top w:type="dxa" w:w="80"/>
-              <w:left w:type="dxa" w:w="120"/>
-              <w:bottom w:type="dxa" w:w="80"/>
-              <w:right w:type="dxa" w:w="120"/>
-            </w:tcMar>
-          </w:tcPr>
-          <w:p>
-            <w:r>
-              <w:rPr>
-                <w:sz w:val="18"/>
-                <w:szCs w:val="18"/>
-              </w:rPr>
-              <w:t xml:space="preserve">Sago Dessert 200g</w:t>
-            </w:r>
-          </w:p>
-        </w:tc>
-        <w:tc>
-          <w:tcPr>
-            <w:tcMar>
-              <w:top w:type="dxa" w:w="80"/>
-              <w:left w:type="dxa" w:w="120"/>
-              <w:bottom w:type="dxa" w:w="80"/>
-              <w:right w:type="dxa" w:w="120"/>
-            </w:tcMar>
-          </w:tcPr>
-          <w:p>
-            <w:r>
-              <w:rPr>
-                <w:sz w:val="18"/>
-                <w:szCs w:val="18"/>
-              </w:rPr>
-              <w:t xml:space="preserve">6</w:t>
-            </w:r>
-          </w:p>
-        </w:tc>
-        <w:tc>
-          <w:tcPr>
-            <w:tcMar>
-              <w:top w:type="dxa" w:w="80"/>
-              <w:left w:type="dxa" w:w="120"/>
-              <w:bottom w:type="dxa" w:w="80"/>
-              <w:right w:type="dxa" w:w="120"/>
-            </w:tcMar>
-          </w:tcPr>
-          <w:p>
-            <w:r>
-              <w:rPr>
-                <w:sz w:val="18"/>
-                <w:szCs w:val="18"/>
-              </w:rPr>
-              <w:t xml:space="preserve">jars</w:t>
-            </w:r>
-          </w:p>
-        </w:tc>
-        <w:tc>
-          <w:tcPr>
-            <w:tcMar>
-              <w:top w:type="dxa" w:w="80"/>
-              <w:left w:type="dxa" w:w="120"/>
-              <w:bottom w:type="dxa" w:w="80"/>
-              <w:right w:type="dxa" w:w="120"/>
-            </w:tcMar>
-          </w:tcPr>
-          <w:p>
-            <w:r>
-              <w:rPr>
-                <w:sz w:val="18"/>
-                <w:szCs w:val="18"/>
-              </w:rPr>
-              <w:t xml:space="preserve">1 carton (6)</w:t>
-            </w:r>
-          </w:p>
-        </w:tc>
-      </w:tr>
-      <w:tr>
-        <w:tc>
-          <w:tcPr>
-            <w:tcMar>
-              <w:top w:type="dxa" w:w="80"/>
-              <w:left w:type="dxa" w:w="120"/>
-              <w:bottom w:type="dxa" w:w="80"/>
-              <w:right w:type="dxa" w:w="120"/>
-            </w:tcMar>
-          </w:tcPr>
-          <w:p>
-            <w:r>
-              <w:rPr>
-                <w:sz w:val="18"/>
-                <w:szCs w:val="18"/>
-              </w:rPr>
-              <w:t xml:space="preserve">—</w:t>
-            </w:r>
-          </w:p>
-        </w:tc>
-        <w:tc>
-          <w:tcPr>
-            <w:tcMar>
-              <w:top w:type="dxa" w:w="80"/>
-              <w:left w:type="dxa" w:w="120"/>
-              <w:bottom w:type="dxa" w:w="80"/>
-              <w:right w:type="dxa" w:w="120"/>
-            </w:tcMar>
-          </w:tcPr>
-          <w:p>
-            <w:r>
-              <w:rPr>
-                <w:sz w:val="18"/>
-                <w:szCs w:val="18"/>
-              </w:rPr>
-              <w:t xml:space="preserve">Sweet Corn Kernel 425g</w:t>
-            </w:r>
-          </w:p>
-        </w:tc>
-        <w:tc>
-          <w:tcPr>
-            <w:tcMar>
-              <w:top w:type="dxa" w:w="80"/>
-              <w:left w:type="dxa" w:w="120"/>
-              <w:bottom w:type="dxa" w:w="80"/>
-              <w:right w:type="dxa" w:w="120"/>
-            </w:tcMar>
-          </w:tcPr>
-          <w:p>
-            <w:r>
-              <w:rPr>
-                <w:sz w:val="18"/>
-                <w:szCs w:val="18"/>
-              </w:rPr>
-              <w:t xml:space="preserve">12</w:t>
-            </w:r>
-          </w:p>
-        </w:tc>
-        <w:tc>
-          <w:tcPr>
-            <w:tcMar>
-              <w:top w:type="dxa" w:w="80"/>
-              <w:left w:type="dxa" w:w="120"/>
-              <w:bottom w:type="dxa" w:w="80"/>
-              <w:right w:type="dxa" w:w="120"/>
-            </w:tcMar>
-          </w:tcPr>
-          <w:p>
-            <w:r>
-              <w:rPr>
-                <w:sz w:val="18"/>
-                <w:szCs w:val="18"/>
-              </w:rPr>
-              <w:t xml:space="preserve">cans</w:t>
-            </w:r>
-          </w:p>
-        </w:tc>
-        <w:tc>
-          <w:tcPr>
-            <w:tcMar>
-              <w:top w:type="dxa" w:w="80"/>
-              <w:left w:type="dxa" w:w="120"/>
-              <w:bottom w:type="dxa" w:w="80"/>
-              <w:right w:type="dxa" w:w="120"/>
-            </w:tcMar>
-          </w:tcPr>
-          <w:p>
-            <w:r>
-              <w:rPr>
-                <w:sz w:val="18"/>
-                <w:szCs w:val="18"/>
-              </w:rPr>
-              <w:t xml:space="preserve">1 carton (12)</w:t>
-            </w:r>
-          </w:p>
-        </w:tc>
-      </w:tr>
-      <w:tr>
-        <w:tc>
-          <w:tcPr>
-            <w:tcMar>
-              <w:top w:type="dxa" w:w="80"/>
-              <w:left w:type="dxa" w:w="120"/>
-              <w:bottom w:type="dxa" w:w="80"/>
-              <w:right w:type="dxa" w:w="120"/>
-            </w:tcMar>
-          </w:tcPr>
-          <w:p>
-            <w:r>
-              <w:rPr>
-                <w:sz w:val="18"/>
-                <w:szCs w:val="18"/>
-              </w:rPr>
-              <w:t xml:space="preserve">—</w:t>
-            </w:r>
-          </w:p>
-        </w:tc>
-        <w:tc>
-          <w:tcPr>
-            <w:tcMar>
-              <w:top w:type="dxa" w:w="80"/>
-              <w:left w:type="dxa" w:w="120"/>
-              <w:bottom w:type="dxa" w:w="80"/>
-              <w:right w:type="dxa" w:w="120"/>
-            </w:tcMar>
-          </w:tcPr>
-          <w:p>
-            <w:r>
-              <w:rPr>
-                <w:sz w:val="18"/>
-                <w:szCs w:val="18"/>
-              </w:rPr>
-              <w:t xml:space="preserve">Sardines in Black Bean Sauce 120g</w:t>
-            </w:r>
-          </w:p>
-        </w:tc>
-        <w:tc>
-          <w:tcPr>
-            <w:tcMar>
-              <w:top w:type="dxa" w:w="80"/>
-              <w:left w:type="dxa" w:w="120"/>
-              <w:bottom w:type="dxa" w:w="80"/>
-              <w:right w:type="dxa" w:w="120"/>
-            </w:tcMar>
-          </w:tcPr>
-          <w:p>
-            <w:r>
-              <w:rPr>
-                <w:sz w:val="18"/>
-                <w:szCs w:val="18"/>
-              </w:rPr>
-              <w:t xml:space="preserve">6</w:t>
             </w:r>
           </w:p>
         </w:tc>

</xml_diff>